<commit_message>
Update moduel 11 assigment
</commit_message>
<xml_diff>
--- a/module-11/BlueTeam_Milestone3.docx
+++ b/module-11/BlueTeam_Milestone3.docx
@@ -24,52 +24,17 @@
         <w:spacing w:line="240" w:lineRule="auto"/>
       </w:pPr>
       <w:r>
-        <w:t xml:space="preserve">This report was generated to show the average number of hours worked per week by each individual employee. This report uses a dataset for </w:t>
+        <w:t>This report was generated to show the average number of hours worked per week by each individual employee. This report uses a dataset for a time period of one month, but could easily be expanded into quarterly or yearly averages. Three outputs are produced: the first is a list of each employee’s ID, followed by their name and average hours worked; the next table shows hours worked by each employee in descending order, and the last organizes this information by the employees last name (alphabetical).</w:t>
       </w:r>
-      <w:proofErr w:type="gramStart"/>
+    </w:p>
+    <w:p>
+      <w:pPr>
+        <w:spacing w:line="240" w:lineRule="auto"/>
+      </w:pPr>
+    </w:p>
+    <w:p>
       <w:r>
-        <w:t>a time period</w:t>
-      </w:r>
-      <w:proofErr w:type="gramEnd"/>
-      <w:r>
-        <w:t xml:space="preserve"> of one </w:t>
-      </w:r>
-      <w:proofErr w:type="gramStart"/>
-      <w:r>
-        <w:t>month, but</w:t>
-      </w:r>
-      <w:proofErr w:type="gramEnd"/>
-      <w:r>
-        <w:t xml:space="preserve"> could easily be expanded into quarterly or yearly averages. Three outputs are produced: the first is a list of each employee’s ID, followed by their name and average hours worked; the next table shows hours worked by each employee in descending order, and the last organizes this information by the </w:t>
-      </w:r>
-      <w:proofErr w:type="gramStart"/>
-      <w:r>
-        <w:t>employees</w:t>
-      </w:r>
-      <w:proofErr w:type="gramEnd"/>
-      <w:r>
-        <w:t xml:space="preserve"> last name (alphabetical).</w:t>
-      </w:r>
-    </w:p>
-    <w:p>
-      <w:pPr>
-        <w:spacing w:line="240" w:lineRule="auto"/>
-      </w:pPr>
-    </w:p>
-    <w:p>
-      <w:r>
-        <w:t xml:space="preserve">Screenshot for Hours Worked over a week </w:t>
-      </w:r>
-      <w:proofErr w:type="gramStart"/>
-      <w:r>
-        <w:t>time perio</w:t>
-      </w:r>
-      <w:r>
-        <w:t>d</w:t>
-      </w:r>
-      <w:proofErr w:type="gramEnd"/>
-      <w:r>
-        <w:t>:</w:t>
+        <w:t>Screenshot for Hours Worked over a week time period:</w:t>
       </w:r>
     </w:p>
     <w:p>
@@ -272,33 +237,20 @@
         <w:t xml:space="preserve">Report 2: </w:t>
       </w:r>
       <w:r>
-        <w:t xml:space="preserve">This report highlights any differences between expected and actual delivery dates from suppliers. The </w:t>
+        <w:t>This report highlights any differences between expected and actual delivery dates from suppliers. The DaysDifference column shows how many days the delivery is off from the anticipated delivery date, and the DeliveryStatus column states whether the delivery was early or on time.</w:t>
       </w:r>
-      <w:proofErr w:type="spellStart"/>
+    </w:p>
+    <w:p>
+      <w:pPr>
+        <w:spacing w:after="0" w:line="240" w:lineRule="auto"/>
+      </w:pPr>
+    </w:p>
+    <w:p>
       <w:r>
-        <w:t>DaysDifference</w:t>
+        <w:t xml:space="preserve">Screenshot shows the </w:t>
       </w:r>
-      <w:proofErr w:type="spellEnd"/>
       <w:r>
-        <w:t xml:space="preserve"> column shows how many days the delivery is off from the anticipated delivery date, and the </w:t>
-      </w:r>
-      <w:proofErr w:type="spellStart"/>
-      <w:r>
-        <w:t>DeliveryStatus</w:t>
-      </w:r>
-      <w:proofErr w:type="spellEnd"/>
-      <w:r>
-        <w:t xml:space="preserve"> column states whether the delivery was early or on time.</w:t>
-      </w:r>
-    </w:p>
-    <w:p>
-      <w:pPr>
-        <w:spacing w:after="0" w:line="240" w:lineRule="auto"/>
-      </w:pPr>
-    </w:p>
-    <w:p>
-      <w:r>
-        <w:t>Screenshot shows the average number of days before or after the delivery date that deliveries arrive for each supplier:</w:t>
+        <w:t>expected vs delivery date:</w:t>
       </w:r>
     </w:p>
     <w:p>
@@ -378,10 +330,7 @@
         <w:spacing w:after="0" w:line="240" w:lineRule="auto"/>
       </w:pPr>
       <w:r>
-        <w:t>Screenshot for each wine each distributor carries</w:t>
-      </w:r>
-      <w:r>
-        <w:t>:</w:t>
+        <w:t>Screenshot for each wine each distributor carries:</w:t>
       </w:r>
     </w:p>
     <w:p>
@@ -393,7 +342,7 @@
           <w:noProof/>
         </w:rPr>
         <w:drawing>
-          <wp:anchor distT="0" distB="0" distL="114300" distR="114300" simplePos="0" relativeHeight="251661312" behindDoc="0" locked="0" layoutInCell="1" allowOverlap="1" wp14:anchorId="423D9387" wp14:editId="59ADFF33">
+          <wp:anchor distT="0" distB="0" distL="114300" distR="114300" simplePos="0" relativeHeight="251661312" behindDoc="0" locked="0" layoutInCell="1" allowOverlap="1" wp14:anchorId="423D9387" wp14:editId="02EC1E77">
             <wp:simplePos x="0" y="0"/>
             <wp:positionH relativeFrom="margin">
               <wp:align>left</wp:align>
@@ -555,23 +504,8 @@
         <w:spacing w:after="0" w:line="240" w:lineRule="auto"/>
       </w:pPr>
       <w:r>
-        <w:t xml:space="preserve">Report </w:t>
-      </w:r>
-      <w:proofErr w:type="gramStart"/>
-      <w:r>
-        <w:t>for</w:t>
-      </w:r>
-      <w:proofErr w:type="gramEnd"/>
-      <w:r>
-        <w:t xml:space="preserve"> total wines sold and wines that haven’t </w:t>
-      </w:r>
-      <w:proofErr w:type="gramStart"/>
-      <w:r>
-        <w:t>sold</w:t>
-      </w:r>
-      <w:proofErr w:type="gramEnd"/>
-      <w:r>
-        <w:t>:</w:t>
+        <w:lastRenderedPageBreak/>
+        <w:t>Report for total wines sold and wines that haven’t sold:</w:t>
       </w:r>
     </w:p>
     <w:p>

</xml_diff>